<commit_message>
feat: complete modern monochrome portfolio with 8 real case studies, enterprise architecture blueprints, and freelance services
</commit_message>
<xml_diff>
--- a/cv/CV_Giovanni_Alfadiansyah_2Page.docx
+++ b/cv/CV_Giovanni_Alfadiansyah_2Page.docx
@@ -609,7 +609,7 @@
           <w:rFonts w:ascii="Segoe UI" w:hAnsi="Segoe UI"/>
           <w:sz w:val="17"/>
         </w:rPr>
-        <w:t>Maintained, monitored, and enhanced CCBM production systems following the revamp, resolving critical incident tickets, optimizing database queries, and ensuring 99.9% uptime for call center agents.</w:t>
+        <w:t>Maintained, monitored, and enhanced CCBM production systems following the revamp, resolving critical incident tickets, optimizing database queries, and improving application speed by up to 30% compared to previous legacy services.</w:t>
       </w:r>
     </w:p>
     <w:p>
@@ -630,7 +630,7 @@
           <w:rFonts w:ascii="Segoe UI" w:hAnsi="Segoe UI"/>
           <w:sz w:val="17"/>
         </w:rPr>
-        <w:t>Designed and implemented scalable RESTful endpoints for real-time customer data retrieval and banking operations, achieving sub-second response times during peak call volumes.</w:t>
+        <w:t>Designed and implemented scalable RESTful endpoints for real-time customer data retrieval and banking operations, ensuring fast and reliable processing during peak call volumes.</w:t>
       </w:r>
     </w:p>
     <w:p>

</xml_diff>